<commit_message>
Update DB Spec Chapter 1
</commit_message>
<xml_diff>
--- a/Database/MykiSystemDesign/ER_Diagram_s4068959.docx
+++ b/Database/MykiSystemDesign/ER_Diagram_s4068959.docx
@@ -3374,6 +3374,22 @@
           <w:t>https://discover.data.vic.gov.au/dataset/annual-regional-train-station-patronage-station-entries/resource/f93a819a-351e-4242-a6f3-74d92cd682dc</w:t>
         </w:r>
       </w:hyperlink>
+    </w:p>
+    <w:p>
+      <w:pPr>
+        <w:rPr>
+          <w:rFonts w:hint="eastAsia"/>
+        </w:rPr>
+      </w:pPr>
+      <w:r>
+        <w:rPr>
+          <w:rFonts w:hint="eastAsia"/>
+        </w:rPr>
+        <w:t xml:space="preserve">ER Diagram {XOR} : </w:t>
+      </w:r>
+      <w:r>
+        <w:t>https://stackoverflow.com/questions/40866828/how-works-xor-constraint-in-uml</w:t>
+      </w:r>
     </w:p>
     <w:p/>
     <w:sectPr>

</xml_diff>

<commit_message>
Complete DDL and TouchOn TSQL
</commit_message>
<xml_diff>
--- a/Database/MykiSystemDesign/ER_Diagram_s4068959.docx
+++ b/Database/MykiSystemDesign/ER_Diagram_s4068959.docx
@@ -4,111 +4,56 @@
   <w:body>
     <w:p>
       <w:pPr>
-        <w:rPr>
-          <w:b/>
-          <w:bCs/>
-        </w:rPr>
-      </w:pPr>
-      <w:r>
-        <w:rPr>
-          <w:rFonts w:hint="eastAsia"/>
-          <w:b/>
-          <w:bCs/>
-        </w:rPr>
-        <w:t>Requirements:</w:t>
+        <w:spacing w:after="0"/>
+        <w:jc w:val="both"/>
+        <w:rPr>
+          <w:rFonts w:ascii="Times New Roman" w:hAnsi="Times New Roman" w:cs="Times New Roman"/>
+          <w:b/>
+          <w:bCs/>
+        </w:rPr>
+      </w:pPr>
+      <w:r>
+        <w:rPr>
+          <w:rFonts w:ascii="Times New Roman" w:hAnsi="Times New Roman" w:cs="Times New Roman" w:hint="eastAsia"/>
+          <w:b/>
+          <w:bCs/>
+          <w:sz w:val="32"/>
+          <w:szCs w:val="32"/>
+        </w:rPr>
+        <w:t>Appendix</w:t>
       </w:r>
     </w:p>
     <w:p>
       <w:pPr>
-        <w:pStyle w:val="a9"/>
-        <w:numPr>
-          <w:ilvl w:val="0"/>
-          <w:numId w:val="5"/>
-        </w:numPr>
-      </w:pPr>
-      <w:r>
-        <w:rPr>
-          <w:rFonts w:hint="eastAsia"/>
-        </w:rPr>
-        <w:t xml:space="preserve">A scanner needs to be installed at one </w:t>
-      </w:r>
-      <w:r>
-        <w:rPr>
-          <w:rFonts w:hint="eastAsia"/>
-        </w:rPr>
-        <w:t xml:space="preserve">device </w:t>
-      </w:r>
-      <w:r>
-        <w:rPr>
-          <w:rFonts w:hint="eastAsia"/>
-        </w:rPr>
-        <w:t xml:space="preserve">location, but one </w:t>
-      </w:r>
-      <w:r>
-        <w:rPr>
-          <w:rFonts w:hint="eastAsia"/>
-        </w:rPr>
-        <w:t xml:space="preserve">device </w:t>
-      </w:r>
-      <w:r>
-        <w:rPr>
-          <w:rFonts w:hint="eastAsia"/>
-        </w:rPr>
-        <w:t>location can have multiple scanners installed.</w:t>
+        <w:spacing w:after="0"/>
+        <w:jc w:val="both"/>
+        <w:rPr>
+          <w:rFonts w:ascii="Times New Roman" w:hAnsi="Times New Roman" w:cs="Times New Roman" w:hint="eastAsia"/>
+          <w:b/>
+          <w:bCs/>
+        </w:rPr>
+      </w:pPr>
+      <w:r>
+        <w:rPr>
+          <w:rFonts w:ascii="Times New Roman" w:hAnsi="Times New Roman" w:cs="Times New Roman" w:hint="eastAsia"/>
+        </w:rPr>
+        <w:t xml:space="preserve">Appendix A.1 </w:t>
+      </w:r>
+      <w:r>
+        <w:rPr>
+          <w:rFonts w:ascii="Times New Roman" w:hAnsi="Times New Roman" w:cs="Times New Roman"/>
+        </w:rPr>
+        <w:t>–</w:t>
+      </w:r>
+      <w:r>
+        <w:rPr>
+          <w:rFonts w:ascii="Times New Roman" w:hAnsi="Times New Roman" w:cs="Times New Roman" w:hint="eastAsia"/>
+        </w:rPr>
+        <w:t xml:space="preserve"> ER Diagram</w:t>
       </w:r>
     </w:p>
     <w:p>
       <w:pPr>
-        <w:pStyle w:val="a9"/>
-        <w:numPr>
-          <w:ilvl w:val="0"/>
-          <w:numId w:val="5"/>
-        </w:numPr>
-      </w:pPr>
-      <w:r>
-        <w:t>D</w:t>
-      </w:r>
-      <w:r>
-        <w:rPr>
-          <w:rFonts w:hint="eastAsia"/>
-        </w:rPr>
-        <w:t>evice locations can belong to tram, bus or stop stations. (Only tram and bus will have scanners in the vehicle; the rest of the scanners should be at the stop stations)</w:t>
-      </w:r>
-    </w:p>
-    <w:p>
-      <w:pPr>
-        <w:rPr>
-          <w:b/>
-          <w:bCs/>
-        </w:rPr>
-      </w:pPr>
-    </w:p>
-    <w:p>
-      <w:pPr>
-        <w:rPr>
-          <w:b/>
-          <w:bCs/>
-        </w:rPr>
-      </w:pPr>
-    </w:p>
-    <w:p>
-      <w:pPr>
-        <w:rPr>
-          <w:b/>
-          <w:bCs/>
-        </w:rPr>
-      </w:pPr>
-    </w:p>
-    <w:p>
-      <w:pPr>
-        <w:rPr>
-          <w:b/>
-          <w:bCs/>
-        </w:rPr>
-      </w:pPr>
-    </w:p>
-    <w:p>
-      <w:pPr>
         <w:rPr>
           <w:b/>
           <w:bCs/>
@@ -120,9 +65,8 @@
           <w:bCs/>
           <w:noProof/>
         </w:rPr>
-        <w:lastRenderedPageBreak/>
         <w:drawing>
-          <wp:inline distT="0" distB="0" distL="0" distR="0" wp14:anchorId="30E7EFB1" wp14:editId="6A6F6AFC">
+          <wp:inline distT="0" distB="0" distL="0" distR="0" wp14:anchorId="7B841FF0" wp14:editId="0B4EBC73">
             <wp:extent cx="8863330" cy="5220335"/>
             <wp:effectExtent l="0" t="0" r="1270" b="0"/>
             <wp:docPr id="811825226" name="圖片 3" descr="一張含有 文字, 圖表, 方案, 地圖 的圖片&#10;&#10;AI 產生的內容可能不正確。"/>
@@ -187,6 +131,135 @@
           <w:bCs/>
         </w:rPr>
       </w:pPr>
+      <w:r>
+        <w:rPr>
+          <w:rFonts w:hint="eastAsia"/>
+          <w:b/>
+          <w:bCs/>
+        </w:rPr>
+        <w:t>Requirements:</w:t>
+      </w:r>
+    </w:p>
+    <w:p>
+      <w:pPr>
+        <w:pStyle w:val="a9"/>
+        <w:numPr>
+          <w:ilvl w:val="0"/>
+          <w:numId w:val="5"/>
+        </w:numPr>
+      </w:pPr>
+      <w:r>
+        <w:rPr>
+          <w:rFonts w:hint="eastAsia"/>
+        </w:rPr>
+        <w:t xml:space="preserve">A scanner needs to be installed at one </w:t>
+      </w:r>
+      <w:r>
+        <w:rPr>
+          <w:rFonts w:hint="eastAsia"/>
+        </w:rPr>
+        <w:t xml:space="preserve">device </w:t>
+      </w:r>
+      <w:r>
+        <w:rPr>
+          <w:rFonts w:hint="eastAsia"/>
+        </w:rPr>
+        <w:t xml:space="preserve">location, but one </w:t>
+      </w:r>
+      <w:r>
+        <w:rPr>
+          <w:rFonts w:hint="eastAsia"/>
+        </w:rPr>
+        <w:t xml:space="preserve">device </w:t>
+      </w:r>
+      <w:r>
+        <w:rPr>
+          <w:rFonts w:hint="eastAsia"/>
+        </w:rPr>
+        <w:t>location can have multiple scanners installed.</w:t>
+      </w:r>
+    </w:p>
+    <w:p>
+      <w:pPr>
+        <w:pStyle w:val="a9"/>
+        <w:numPr>
+          <w:ilvl w:val="0"/>
+          <w:numId w:val="5"/>
+        </w:numPr>
+      </w:pPr>
+      <w:r>
+        <w:t>D</w:t>
+      </w:r>
+      <w:r>
+        <w:rPr>
+          <w:rFonts w:hint="eastAsia"/>
+        </w:rPr>
+        <w:t>evice locations can belong to tram, bus or stop stations. (Only tram and bus will have scanners in the vehicle; the rest of the scanners should be at the stop stations)</w:t>
+      </w:r>
+    </w:p>
+    <w:p>
+      <w:pPr>
+        <w:rPr>
+          <w:b/>
+          <w:bCs/>
+        </w:rPr>
+      </w:pPr>
+    </w:p>
+    <w:p>
+      <w:pPr>
+        <w:rPr>
+          <w:b/>
+          <w:bCs/>
+        </w:rPr>
+      </w:pPr>
+    </w:p>
+    <w:p>
+      <w:pPr>
+        <w:rPr>
+          <w:b/>
+          <w:bCs/>
+        </w:rPr>
+      </w:pPr>
+    </w:p>
+    <w:p>
+      <w:pPr>
+        <w:rPr>
+          <w:b/>
+          <w:bCs/>
+        </w:rPr>
+      </w:pPr>
+    </w:p>
+    <w:p>
+      <w:pPr>
+        <w:rPr>
+          <w:b/>
+          <w:bCs/>
+        </w:rPr>
+      </w:pPr>
+    </w:p>
+    <w:p>
+      <w:pPr>
+        <w:rPr>
+          <w:b/>
+          <w:bCs/>
+        </w:rPr>
+      </w:pPr>
+    </w:p>
+    <w:p>
+      <w:pPr>
+        <w:rPr>
+          <w:b/>
+          <w:bCs/>
+        </w:rPr>
+      </w:pPr>
+    </w:p>
+    <w:p>
+      <w:pPr>
+        <w:rPr>
+          <w:b/>
+          <w:bCs/>
+        </w:rPr>
+      </w:pPr>
     </w:p>
     <w:p>
       <w:pPr>
@@ -305,6 +378,7 @@
         <w:rPr>
           <w:rFonts w:hint="eastAsia"/>
         </w:rPr>
+        <w:lastRenderedPageBreak/>
         <w:t xml:space="preserve">This assumption will change the mechanism only deducts when </w:t>
       </w:r>
       <w:r>
@@ -607,7 +681,6 @@
         <w:rPr>
           <w:rFonts w:hint="eastAsia"/>
         </w:rPr>
-        <w:lastRenderedPageBreak/>
         <w:t>If you travel only within Zone 1/2 boundary overlap and Zone 2, the system will charge you only the</w:t>
       </w:r>
       <w:r>
@@ -1011,7 +1084,6 @@
               <w:ind w:left="326" w:hanging="283"/>
             </w:pPr>
             <w:r>
-              <w:lastRenderedPageBreak/>
               <w:t>password_hash</w:t>
             </w:r>
           </w:p>
@@ -1030,7 +1102,6 @@
               <w:ind w:left="326" w:hanging="283"/>
             </w:pPr>
             <w:r>
-              <w:lastRenderedPageBreak/>
               <w:t>Optional</w:t>
             </w:r>
             <w:r>
@@ -1125,6 +1196,7 @@
               <w:ind w:left="326" w:hanging="283"/>
             </w:pPr>
             <w:r>
+              <w:lastRenderedPageBreak/>
               <w:t>Used to initiate trips and hold value</w:t>
             </w:r>
           </w:p>
@@ -1144,6 +1216,7 @@
               <w:ind w:left="326" w:hanging="283"/>
             </w:pPr>
             <w:r>
+              <w:lastRenderedPageBreak/>
               <w:t>card_id (PK)</w:t>
             </w:r>
           </w:p>
@@ -1277,6 +1350,7 @@
               <w:rPr>
                 <w:rFonts w:hint="eastAsia"/>
               </w:rPr>
+              <w:lastRenderedPageBreak/>
               <w:t>Senior</w:t>
             </w:r>
           </w:p>
@@ -1300,6 +1374,7 @@
                 <w:b/>
                 <w:bCs/>
               </w:rPr>
+              <w:lastRenderedPageBreak/>
               <w:t>Trip</w:t>
             </w:r>
           </w:p>
@@ -1678,14 +1753,7 @@
               <w:rPr>
                 <w:rFonts w:hint="eastAsia"/>
               </w:rPr>
-              <w:t xml:space="preserve"> (May within 2 hours free </w:t>
-            </w:r>
-            <w:r>
-              <w:rPr>
-                <w:rFonts w:hint="eastAsia"/>
-              </w:rPr>
-              <w:lastRenderedPageBreak/>
-              <w:t>period)</w:t>
+              <w:t xml:space="preserve"> (May within 2 hours free period)</w:t>
             </w:r>
           </w:p>
         </w:tc>
@@ -1706,7 +1774,6 @@
               <w:rPr>
                 <w:rFonts w:hint="eastAsia"/>
               </w:rPr>
-              <w:lastRenderedPageBreak/>
               <w:t>transaction_id (PK)</w:t>
             </w:r>
           </w:p>
@@ -1803,7 +1870,6 @@
               <w:rPr>
                 <w:rFonts w:hint="eastAsia"/>
               </w:rPr>
-              <w:lastRenderedPageBreak/>
               <w:t>timestamp</w:t>
             </w:r>
           </w:p>
@@ -1822,7 +1888,6 @@
               <w:ind w:left="326" w:hanging="283"/>
             </w:pPr>
             <w:r>
-              <w:lastRenderedPageBreak/>
               <w:t xml:space="preserve">Types </w:t>
             </w:r>
             <w:r>
@@ -1940,7 +2005,14 @@
               <w:rPr>
                 <w:rFonts w:hint="eastAsia"/>
               </w:rPr>
-              <w:t xml:space="preserve"> or any interaction regarding Myki card</w:t>
+              <w:t xml:space="preserve"> or any </w:t>
+            </w:r>
+            <w:r>
+              <w:rPr>
+                <w:rFonts w:hint="eastAsia"/>
+              </w:rPr>
+              <w:lastRenderedPageBreak/>
+              <w:t>interaction regarding Myki card</w:t>
             </w:r>
           </w:p>
         </w:tc>
@@ -1958,6 +2030,7 @@
               <w:ind w:left="326" w:hanging="283"/>
             </w:pPr>
             <w:r>
+              <w:lastRenderedPageBreak/>
               <w:t>scanner_id (PK)</w:t>
             </w:r>
           </w:p>
@@ -2017,7 +2090,11 @@
               <w:ind w:left="326" w:hanging="283"/>
             </w:pPr>
             <w:r>
-              <w:t>Connected to either vehicle or stop station via DeviceLocation</w:t>
+              <w:t xml:space="preserve">Connected to either </w:t>
+            </w:r>
+            <w:r>
+              <w:lastRenderedPageBreak/>
+              <w:t>vehicle or stop station via DeviceLocation</w:t>
             </w:r>
           </w:p>
         </w:tc>
@@ -2040,6 +2117,7 @@
                 <w:b/>
                 <w:bCs/>
               </w:rPr>
+              <w:lastRenderedPageBreak/>
               <w:t>DeviceLocation</w:t>
             </w:r>
           </w:p>
@@ -2543,7 +2621,6 @@
               <w:ind w:left="326" w:hanging="283"/>
             </w:pPr>
             <w:r>
-              <w:lastRenderedPageBreak/>
               <w:t>direction (PK)</w:t>
             </w:r>
           </w:p>
@@ -2575,12 +2652,7 @@
               <w:ind w:left="326" w:hanging="283"/>
             </w:pPr>
             <w:r>
-              <w:lastRenderedPageBreak/>
-              <w:t xml:space="preserve">Composite PK defines stop identity within route </w:t>
-            </w:r>
-            <w:r>
-              <w:lastRenderedPageBreak/>
-              <w:t>direction</w:t>
+              <w:t>Composite PK defines stop identity within route direction</w:t>
             </w:r>
           </w:p>
         </w:tc>
@@ -2602,7 +2674,6 @@
                 <w:b/>
                 <w:bCs/>
               </w:rPr>
-              <w:lastRenderedPageBreak/>
               <w:t>Vehicle</w:t>
             </w:r>
           </w:p>
@@ -2710,7 +2781,11 @@
               <w:ind w:left="326" w:hanging="283"/>
             </w:pPr>
             <w:r>
-              <w:t>A single operational instance of a vehicle on a route</w:t>
+              <w:t xml:space="preserve">A single operational instance </w:t>
+            </w:r>
+            <w:r>
+              <w:lastRenderedPageBreak/>
+              <w:t>of a vehicle on a route</w:t>
             </w:r>
           </w:p>
         </w:tc>
@@ -2728,6 +2803,7 @@
               <w:ind w:left="326" w:hanging="283"/>
             </w:pPr>
             <w:r>
+              <w:lastRenderedPageBreak/>
               <w:t>run_id (PK)</w:t>
             </w:r>
           </w:p>
@@ -2741,6 +2817,7 @@
               <w:ind w:left="326" w:hanging="283"/>
             </w:pPr>
             <w:r>
+              <w:lastRenderedPageBreak/>
               <w:t>vehicle_id (FK)</w:t>
             </w:r>
           </w:p>
@@ -2798,7 +2875,12 @@
               <w:ind w:left="326" w:hanging="283"/>
             </w:pPr>
             <w:r>
-              <w:t>Used to track daily or scheduled trips of a vehicle</w:t>
+              <w:lastRenderedPageBreak/>
+              <w:t xml:space="preserve">Used to track daily or </w:t>
+            </w:r>
+            <w:r>
+              <w:lastRenderedPageBreak/>
+              <w:t>scheduled trips of a vehicle</w:t>
             </w:r>
           </w:p>
         </w:tc>
@@ -2820,6 +2902,7 @@
                 <w:b/>
                 <w:bCs/>
               </w:rPr>
+              <w:lastRenderedPageBreak/>
               <w:t>VehicleStopLog</w:t>
             </w:r>
           </w:p>
@@ -3243,7 +3326,16 @@
           <w:b/>
           <w:bCs/>
         </w:rPr>
-        <w:t xml:space="preserve"> lookup VehicleStopLog or VehicleRealTimeLog  </w:t>
+        <w:t xml:space="preserve"> lookup VehicleStopLog or </w:t>
+      </w:r>
+      <w:r>
+        <w:rPr>
+          <w:rFonts w:hint="eastAsia"/>
+          <w:b/>
+          <w:bCs/>
+        </w:rPr>
+        <w:lastRenderedPageBreak/>
+        <w:t xml:space="preserve">VehicleRealTimeLog  </w:t>
       </w:r>
       <w:r>
         <w:rPr>
@@ -3391,7 +3483,13 @@
         <w:t>https://stackoverflow.com/questions/40866828/how-works-xor-constraint-in-uml</w:t>
       </w:r>
     </w:p>
-    <w:p/>
+    <w:p>
+      <w:pPr>
+        <w:rPr>
+          <w:rFonts w:hint="eastAsia"/>
+        </w:rPr>
+      </w:pPr>
+    </w:p>
     <w:sectPr>
       <w:pgSz w:w="16838" w:h="11906" w:orient="landscape"/>
       <w:pgMar w:top="1080" w:right="1440" w:bottom="1080" w:left="1440" w:header="851" w:footer="992" w:gutter="0"/>

</xml_diff>